<commit_message>
Update Data and code availability with GitHub + Zenodo DOI
</commit_message>
<xml_diff>
--- a/manuscript/manuscript.docx
+++ b/manuscript/manuscript.docx
@@ -41,6 +41,12 @@
       <w:r>
         <w:t xml:space="preserve">* Corresponding author. hidenori.tani@yok.hamayaku.ac.jp</w:t>
       </w:r>
+      <w:r>
+        <w:t xml:space="preserve"> </w:t>
+      </w:r>
+      <w:r>
+        <w:t xml:space="preserve">ORCID: 0000-0001-6390-4136</w:t>
+      </w:r>
     </w:p>
     <w:p>
       <w:r>
@@ -69,67 +75,61 @@
         <w:t xml:space="preserve"> </w:t>
       </w:r>
       <w:r>
-        <w:t xml:space="preserve">one of the most functionally opaque classes of transcripts, and a wave of RNA</w:t>
-      </w:r>
-      <w:r>
-        <w:t xml:space="preserve"> </w:t>
-      </w:r>
-      <w:r>
-        <w:t xml:space="preserve">foundation models promises to read function directly from sequence. Using transcript</w:t>
-      </w:r>
-      <w:r>
-        <w:t xml:space="preserve"> </w:t>
-      </w:r>
-      <w:r>
-        <w:t xml:space="preserve">half-life as a concrete functional axis, we benchmark five lncRNA-relevant</w:t>
-      </w:r>
-      <w:r>
-        <w:t xml:space="preserve"> </w:t>
-      </w:r>
-      <w:r>
-        <w:t xml:space="preserve">representation classes — two models tested directly and three model families</w:t>
-      </w:r>
-      <w:r>
-        <w:t xml:space="preserve"> </w:t>
-      </w:r>
-      <w:r>
-        <w:t xml:space="preserve">approximated by tractable proxies — against measured RNA turnover across four</w:t>
-      </w:r>
-      <w:r>
-        <w:t xml:space="preserve"> </w:t>
-      </w:r>
-      <w:r>
-        <w:t xml:space="preserve">mammalian cell contexts, covering 256 GENCODE v44 lncRNAs with transcriptome-wide</w:t>
-      </w:r>
-      <w:r>
-        <w:t xml:space="preserve"> </w:t>
-      </w:r>
-      <w:r>
-        <w:t xml:space="preserve">half-life measurements. In this benchmark, none of the tested or proxy-evaluated</w:t>
-      </w:r>
-      <w:r>
-        <w:t xml:space="preserve"> </w:t>
-      </w:r>
-      <w:r>
-        <w:t xml:space="preserve">representations exceeded AUROC 0.70 or supported robust continuous regression, and</w:t>
-      </w:r>
-      <w:r>
-        <w:t xml:space="preserve"> </w:t>
-      </w:r>
-      <w:r>
-        <w:t xml:space="preserve">all performed similarly to simple k-mer composition baselines; performance on</w:t>
-      </w:r>
-      <w:r>
-        <w:t xml:space="preserve"> </w:t>
-      </w:r>
-      <w:r>
-        <w:t xml:space="preserve">transcripts with documented dynamic regulation was systematically weak. We</w:t>
-      </w:r>
-      <w:r>
-        <w:t xml:space="preserve"> </w:t>
-      </w:r>
-      <w:r>
-        <w:t xml:space="preserve">interpret this shared ceiling as evidence of an</w:t>
+        <w:t xml:space="preserve">functionally opaque, and a wave of RNA foundation models promises to read function</w:t>
+      </w:r>
+      <w:r>
+        <w:t xml:space="preserve"> </w:t>
+      </w:r>
+      <w:r>
+        <w:t xml:space="preserve">directly from sequence. Using transcript half-life as a concrete functional axis,</w:t>
+      </w:r>
+      <w:r>
+        <w:t xml:space="preserve"> </w:t>
+      </w:r>
+      <w:r>
+        <w:t xml:space="preserve">we benchmark five lncRNA-relevant representation classes — two directly evaluated,</w:t>
+      </w:r>
+      <w:r>
+        <w:t xml:space="preserve"> </w:t>
+      </w:r>
+      <w:r>
+        <w:t xml:space="preserve">three approximated by tractable proxies — against measured RNA turnover across</w:t>
+      </w:r>
+      <w:r>
+        <w:t xml:space="preserve"> </w:t>
+      </w:r>
+      <w:r>
+        <w:t xml:space="preserve">four mammalian cell systems, covering 256 lncRNAs with transcriptome-wide</w:t>
+      </w:r>
+      <w:r>
+        <w:t xml:space="preserve"> </w:t>
+      </w:r>
+      <w:r>
+        <w:t xml:space="preserve">half-life measurements. No tested or proxy-evaluated representation exceeded</w:t>
+      </w:r>
+      <w:r>
+        <w:t xml:space="preserve"> </w:t>
+      </w:r>
+      <w:r>
+        <w:t xml:space="preserve">AUROC 0.70 or supported robust continuous regression, and all performed similarly</w:t>
+      </w:r>
+      <w:r>
+        <w:t xml:space="preserve"> </w:t>
+      </w:r>
+      <w:r>
+        <w:t xml:space="preserve">to simple k-mer composition baselines; performance on transcripts with documented</w:t>
+      </w:r>
+      <w:r>
+        <w:t xml:space="preserve"> </w:t>
+      </w:r>
+      <w:r>
+        <w:t xml:space="preserve">dynamic regulation was systematically weak. We interpret this shared ceiling as</w:t>
+      </w:r>
+      <w:r>
+        <w:t xml:space="preserve"> </w:t>
+      </w:r>
+      <w:r>
+        <w:t xml:space="preserve">an</w:t>
       </w:r>
       <w:r>
         <w:t xml:space="preserve"> </w:t>
@@ -145,67 +145,53 @@
         <w:t xml:space="preserve"> </w:t>
       </w:r>
       <w:r>
-        <w:t xml:space="preserve">between the</w:t>
-      </w:r>
-      <w:r>
-        <w:t xml:space="preserve"> </w:t>
-      </w:r>
-      <w:r>
-        <w:t xml:space="preserve">static pretraining signal available to sequence-only models and the dynamic cellular</w:t>
-      </w:r>
-      <w:r>
-        <w:t xml:space="preserve"> </w:t>
-      </w:r>
-      <w:r>
-        <w:t xml:space="preserve">state on which lncRNA function most clearly depends. We introduce</w:t>
-      </w:r>
-      <w:r>
-        <w:t xml:space="preserve"> </w:t>
-      </w:r>
-      <w:r>
-        <w:rPr>
-          <w:i/>
-          <w:iCs/>
-        </w:rPr>
-        <w:t xml:space="preserve">dynamic</w:t>
-      </w:r>
-      <w:r>
-        <w:rPr>
-          <w:i/>
-          <w:iCs/>
-        </w:rPr>
-        <w:t xml:space="preserve"> </w:t>
-      </w:r>
-      <w:r>
-        <w:rPr>
-          <w:i/>
-          <w:iCs/>
-        </w:rPr>
-        <w:t xml:space="preserve">grounding</w:t>
-      </w:r>
-      <w:r>
-        <w:t xml:space="preserve"> </w:t>
-      </w:r>
-      <w:r>
-        <w:t xml:space="preserve">— a model-agnostic, post-hoc conditioning of static predictions on</w:t>
-      </w:r>
-      <w:r>
-        <w:t xml:space="preserve"> </w:t>
-      </w:r>
-      <w:r>
-        <w:t xml:space="preserve">orthogonal measured state variables such as turnover and localisation — and</w:t>
-      </w:r>
-      <w:r>
-        <w:t xml:space="preserve"> </w:t>
-      </w:r>
-      <w:r>
-        <w:t xml:space="preserve">advocate a tiered static × dynamic evaluation standard for foundation models whose</w:t>
-      </w:r>
-      <w:r>
-        <w:t xml:space="preserve"> </w:t>
-      </w:r>
-      <w:r>
-        <w:t xml:space="preserve">evaluation labels depend on unobserved state.</w:t>
+        <w:t xml:space="preserve">between the static pretraining signal available to</w:t>
+      </w:r>
+      <w:r>
+        <w:t xml:space="preserve"> </w:t>
+      </w:r>
+      <w:r>
+        <w:t xml:space="preserve">sequence-only models and the dynamic cellular state on which lncRNA function</w:t>
+      </w:r>
+      <w:r>
+        <w:t xml:space="preserve"> </w:t>
+      </w:r>
+      <w:r>
+        <w:t xml:space="preserve">most clearly depends. We introduce</w:t>
+      </w:r>
+      <w:r>
+        <w:t xml:space="preserve"> </w:t>
+      </w:r>
+      <w:r>
+        <w:rPr>
+          <w:i/>
+          <w:iCs/>
+        </w:rPr>
+        <w:t xml:space="preserve">dynamic grounding</w:t>
+      </w:r>
+      <w:r>
+        <w:t xml:space="preserve"> </w:t>
+      </w:r>
+      <w:r>
+        <w:t xml:space="preserve">— a model-agnostic,</w:t>
+      </w:r>
+      <w:r>
+        <w:t xml:space="preserve"> </w:t>
+      </w:r>
+      <w:r>
+        <w:t xml:space="preserve">post-hoc conditioning of static predictions on measured state variables such as</w:t>
+      </w:r>
+      <w:r>
+        <w:t xml:space="preserve"> </w:t>
+      </w:r>
+      <w:r>
+        <w:t xml:space="preserve">turnover and localisation — and advocate a tiered static × dynamic evaluation</w:t>
+      </w:r>
+      <w:r>
+        <w:t xml:space="preserve"> </w:t>
+      </w:r>
+      <w:r>
+        <w:t xml:space="preserve">standard for foundation models whose labels depend on unobserved state.</w:t>
       </w:r>
     </w:p>
     <w:p>
@@ -606,44 +592,6 @@
         <w:pStyle w:val="BodyText"/>
       </w:pPr>
       <w:r>
-        <w:t xml:space="preserve">For machine-learning practitioners, lncRNA stability thus serves as a concrete</w:t>
-      </w:r>
-      <w:r>
-        <w:t xml:space="preserve"> </w:t>
-      </w:r>
-      <w:r>
-        <w:t xml:space="preserve">case study of a general pattern: foundation models are increasingly evaluated on</w:t>
-      </w:r>
-      <w:r>
-        <w:t xml:space="preserve"> </w:t>
-      </w:r>
-      <w:r>
-        <w:t xml:space="preserve">labels that depend on latent state variables absent from their pretraining</w:t>
-      </w:r>
-      <w:r>
-        <w:t xml:space="preserve"> </w:t>
-      </w:r>
-      <w:r>
-        <w:t xml:space="preserve">corpora. Such gaps are best addressed with evaluation standards and post-hoc</w:t>
-      </w:r>
-      <w:r>
-        <w:t xml:space="preserve"> </w:t>
-      </w:r>
-      <w:r>
-        <w:t xml:space="preserve">conditioning schemes compatible with existing model weights, rather than deferred</w:t>
-      </w:r>
-      <w:r>
-        <w:t xml:space="preserve"> </w:t>
-      </w:r>
-      <w:r>
-        <w:t xml:space="preserve">to the next pretraining cycle.</w:t>
-      </w:r>
-    </w:p>
-    <w:p>
-      <w:pPr>
-        <w:pStyle w:val="BodyText"/>
-      </w:pPr>
-      <w:r>
         <w:t xml:space="preserve">The empirical scope of this Perspective is deliberately narrow: lncRNA</w:t>
       </w:r>
       <w:r>
@@ -1305,7 +1253,7 @@
         <w:t xml:space="preserve"> </w:t>
       </w:r>
       <w:r>
-        <w:t xml:space="preserve">one cell system; 116 are binary-classifiable as stable (half-life &gt; 8 h) or</w:t>
+        <w:t xml:space="preserve">one cell system; 116 are binary-classifiable as stable (half-life &gt; 4 h) or</w:t>
       </w:r>
       <w:r>
         <w:t xml:space="preserve"> </w:t>
@@ -1419,13 +1367,22 @@
         <w:t xml:space="preserve"> </w:t>
       </w:r>
       <w:r>
-        <w:t xml:space="preserve">setting — a level often treated as a useful-for-prioritisation threshold in</w:t>
-      </w:r>
-      <w:r>
-        <w:t xml:space="preserve"> </w:t>
-      </w:r>
-      <w:r>
-        <w:t xml:space="preserve">comparable RNA benchmarks. Taken together, these results suggest that under the</w:t>
+        <w:t xml:space="preserve">setting — a level we adopt here as an informal usefulness threshold, consistent</w:t>
+      </w:r>
+      <w:r>
+        <w:t xml:space="preserve"> </w:t>
+      </w:r>
+      <w:r>
+        <w:t xml:space="preserve">with recent independent RNA foundation-model comparisons</w:t>
+      </w:r>
+      <w:r>
+        <w:rPr>
+          <w:vertAlign w:val="superscript"/>
+        </w:rPr>
+        <w:t xml:space="preserve">13</w:t>
+      </w:r>
+      <w:r>
+        <w:t xml:space="preserve">. Taken together, these results suggest that under the</w:t>
       </w:r>
       <w:r>
         <w:t xml:space="preserve"> </w:t>
@@ -1694,54 +1651,42 @@
         <w:t xml:space="preserve"> </w:t>
       </w:r>
       <w:r>
-        <w:t xml:space="preserve">context-dependent —</w:t>
-      </w:r>
-      <w:r>
-        <w:t xml:space="preserve"> </w:t>
-      </w:r>
-      <w:r>
-        <w:rPr>
-          <w:i/>
-          <w:iCs/>
-        </w:rPr>
-        <w:t xml:space="preserve">NEAT1</w:t>
-      </w:r>
-      <w:r>
-        <w:t xml:space="preserve">, central to paraspeckle assembly</w:t>
+        <w:t xml:space="preserve">context-dependent — notably</w:t>
+      </w:r>
+      <w:r>
+        <w:t xml:space="preserve"> </w:t>
+      </w:r>
+      <w:r>
+        <w:rPr>
+          <w:i/>
+          <w:iCs/>
+        </w:rPr>
+        <w:t xml:space="preserve">XIST</w:t>
       </w:r>
       <w:r>
         <w:rPr>
           <w:vertAlign w:val="superscript"/>
         </w:rPr>
-        <w:t xml:space="preserve">3</w:t>
-      </w:r>
-      <w:r>
-        <w:t xml:space="preserve">, and</w:t>
-      </w:r>
-      <w:r>
-        <w:t xml:space="preserve"> </w:t>
-      </w:r>
-      <w:r>
-        <w:rPr>
-          <w:i/>
-          <w:iCs/>
-        </w:rPr>
-        <w:t xml:space="preserve">MALAT1</w:t>
-      </w:r>
-      <w:r>
-        <w:t xml:space="preserve">, a</w:t>
-      </w:r>
-      <w:r>
-        <w:t xml:space="preserve"> </w:t>
-      </w:r>
-      <w:r>
-        <w:t xml:space="preserve">nuclear-retained lncRNA that modulates SR-protein phosphorylation and associated</w:t>
-      </w:r>
-      <w:r>
-        <w:t xml:space="preserve"> </w:t>
-      </w:r>
-      <w:r>
-        <w:t xml:space="preserve">splicing regulation</w:t>
+        <w:t xml:space="preserve">4</w:t>
+      </w:r>
+      <w:r>
+        <w:t xml:space="preserve">, which guides developmental</w:t>
+      </w:r>
+      <w:r>
+        <w:t xml:space="preserve"> </w:t>
+      </w:r>
+      <w:r>
+        <w:t xml:space="preserve">X-chromosome inactivation through chromatin-state–dependent regulation, and</w:t>
+      </w:r>
+      <w:r>
+        <w:t xml:space="preserve"> </w:t>
+      </w:r>
+      <w:r>
+        <w:rPr>
+          <w:i/>
+          <w:iCs/>
+        </w:rPr>
+        <w:t xml:space="preserve">NORAD</w:t>
       </w:r>
       <w:r>
         <w:rPr>
@@ -1750,34 +1695,76 @@
         <w:t xml:space="preserve">14</w:t>
       </w:r>
       <w:r>
-        <w:t xml:space="preserve"> </w:t>
-      </w:r>
-      <w:r>
-        <w:t xml:space="preserve">— alongside additional lncRNAs previously reported to</w:t>
-      </w:r>
-      <w:r>
-        <w:t xml:space="preserve"> </w:t>
-      </w:r>
-      <w:r>
-        <w:t xml:space="preserve">exhibit cell-cycle-regulated or stress-responsive behaviour. These serve as</w:t>
-      </w:r>
-      <w:r>
-        <w:t xml:space="preserve"> </w:t>
-      </w:r>
-      <w:r>
-        <w:t xml:space="preserve">illustrative examples of transcripts for which a static sequence snapshot is</w:t>
-      </w:r>
-      <w:r>
-        <w:t xml:space="preserve"> </w:t>
-      </w:r>
-      <w:r>
-        <w:t xml:space="preserve">unlikely to capture the relevant regulatory context, rather than as a biological</w:t>
-      </w:r>
-      <w:r>
-        <w:t xml:space="preserve"> </w:t>
-      </w:r>
-      <w:r>
-        <w:t xml:space="preserve">claim about the 12-transcript set as a whole. The pattern is consistent with the</w:t>
+        <w:t xml:space="preserve">, a cytoplasmic lncRNA induced by DNA damage that sequesters PUMILIO</w:t>
+      </w:r>
+      <w:r>
+        <w:t xml:space="preserve"> </w:t>
+      </w:r>
+      <w:r>
+        <w:t xml:space="preserve">proteins — alongside additional transcripts (</w:t>
+      </w:r>
+      <w:r>
+        <w:rPr>
+          <w:i/>
+          <w:iCs/>
+        </w:rPr>
+        <w:t xml:space="preserve">TTTY14</w:t>
+      </w:r>
+      <w:r>
+        <w:t xml:space="preserve">,</w:t>
+      </w:r>
+      <w:r>
+        <w:t xml:space="preserve"> </w:t>
+      </w:r>
+      <w:r>
+        <w:rPr>
+          <w:i/>
+          <w:iCs/>
+        </w:rPr>
+        <w:t xml:space="preserve">MCM3AP-AS1</w:t>
+      </w:r>
+      <w:r>
+        <w:t xml:space="preserve">,</w:t>
+      </w:r>
+      <w:r>
+        <w:t xml:space="preserve"> </w:t>
+      </w:r>
+      <w:r>
+        <w:rPr>
+          <w:i/>
+          <w:iCs/>
+        </w:rPr>
+        <w:t xml:space="preserve">NBR2</w:t>
+      </w:r>
+      <w:r>
+        <w:t xml:space="preserve"> </w:t>
+      </w:r>
+      <w:r>
+        <w:t xml:space="preserve">and</w:t>
+      </w:r>
+      <w:r>
+        <w:t xml:space="preserve"> </w:t>
+      </w:r>
+      <w:r>
+        <w:t xml:space="preserve">others) with reported cell-type-specific or stress-responsive expression. These</w:t>
+      </w:r>
+      <w:r>
+        <w:t xml:space="preserve"> </w:t>
+      </w:r>
+      <w:r>
+        <w:t xml:space="preserve">serve as illustrative examples of transcripts for which a static sequence snapshot</w:t>
+      </w:r>
+      <w:r>
+        <w:t xml:space="preserve"> </w:t>
+      </w:r>
+      <w:r>
+        <w:t xml:space="preserve">is unlikely to capture the relevant regulatory context, rather than as a</w:t>
+      </w:r>
+      <w:r>
+        <w:t xml:space="preserve"> </w:t>
+      </w:r>
+      <w:r>
+        <w:t xml:space="preserve">biological claim about the 12-transcript set as a whole. The pattern is consistent with the</w:t>
       </w:r>
       <w:r>
         <w:t xml:space="preserve"> </w:t>
@@ -1803,19 +1790,19 @@
         <w:t xml:space="preserve"> </w:t>
       </w:r>
       <w:r>
-        <w:t xml:space="preserve">relatively better on short lncRNAs (≤ 1.5 kb) and degrading on longer ones,</w:t>
-      </w:r>
-      <w:r>
-        <w:t xml:space="preserve"> </w:t>
-      </w:r>
-      <w:r>
-        <w:t xml:space="preserve">consistent with its 1,024-nucleotide context window, whereas the Evo-class proxy</w:t>
-      </w:r>
-      <w:r>
-        <w:t xml:space="preserve"> </w:t>
-      </w:r>
-      <w:r>
-        <w:t xml:space="preserve">shows the opposite trend. Context length constrains which static features a model</w:t>
+        <w:t xml:space="preserve">relatively better on shorter lncRNAs and degrading on longer ones — consistent</w:t>
+      </w:r>
+      <w:r>
+        <w:t xml:space="preserve"> </w:t>
+      </w:r>
+      <w:r>
+        <w:t xml:space="preserve">with its 1,024-nucleotide context window — whereas the Evo-class proxy shows the</w:t>
+      </w:r>
+      <w:r>
+        <w:t xml:space="preserve"> </w:t>
+      </w:r>
+      <w:r>
+        <w:t xml:space="preserve">opposite trend. Context length constrains which static features a model</w:t>
       </w:r>
       <w:r>
         <w:t xml:space="preserve"> </w:t>
@@ -2347,6 +2334,462 @@
       </w:r>
     </w:p>
     <w:p>
+      <w:pPr>
+        <w:pStyle w:val="BodyText"/>
+      </w:pPr>
+      <w:r>
+        <w:rPr>
+          <w:b/>
+          <w:bCs/>
+        </w:rPr>
+        <w:t xml:space="preserve">Why not retrain, fine-tune, or scale?</w:t>
+      </w:r>
+      <w:r>
+        <w:t xml:space="preserve"> </w:t>
+      </w:r>
+      <w:r>
+        <w:t xml:space="preserve">Three natural objections deserve</w:t>
+      </w:r>
+      <w:r>
+        <w:t xml:space="preserve"> </w:t>
+      </w:r>
+      <w:r>
+        <w:t xml:space="preserve">explicit replies.</w:t>
+      </w:r>
+      <w:r>
+        <w:t xml:space="preserve"> </w:t>
+      </w:r>
+      <w:r>
+        <w:rPr>
+          <w:i/>
+          <w:iCs/>
+        </w:rPr>
+        <w:t xml:space="preserve">Retraining.</w:t>
+      </w:r>
+      <w:r>
+        <w:t xml:space="preserve"> </w:t>
+      </w:r>
+      <w:r>
+        <w:t xml:space="preserve">The most direct response to an observability</w:t>
+      </w:r>
+      <w:r>
+        <w:t xml:space="preserve"> </w:t>
+      </w:r>
+      <w:r>
+        <w:t xml:space="preserve">gap is to fold turnover and localisation measurements into the pretraining</w:t>
+      </w:r>
+      <w:r>
+        <w:t xml:space="preserve"> </w:t>
+      </w:r>
+      <w:r>
+        <w:t xml:space="preserve">corpus itself. In the long run this is almost certainly where the field will</w:t>
+      </w:r>
+      <w:r>
+        <w:t xml:space="preserve"> </w:t>
+      </w:r>
+      <w:r>
+        <w:t xml:space="preserve">land. In the short run it is not tractable: the union of published BRIC-seq,</w:t>
+      </w:r>
+      <w:r>
+        <w:t xml:space="preserve"> </w:t>
+      </w:r>
+      <w:r>
+        <w:t xml:space="preserve">SLAM-seq and TimeLapse-seq experiments covers of the order of 10</w:t>
+      </w:r>
+      <w:r>
+        <w:rPr>
+          <w:vertAlign w:val="superscript"/>
+        </w:rPr>
+        <w:t xml:space="preserve">4</w:t>
+      </w:r>
+      <w:r>
+        <w:t xml:space="preserve"> </w:t>
+      </w:r>
+      <w:r>
+        <w:t xml:space="preserve">annotated</w:t>
+      </w:r>
+      <w:r>
+        <w:t xml:space="preserve"> </w:t>
+      </w:r>
+      <w:r>
+        <w:t xml:space="preserve">transcripts across a handful of cell systems</w:t>
+      </w:r>
+      <w:r>
+        <w:rPr>
+          <w:vertAlign w:val="superscript"/>
+        </w:rPr>
+        <w:t xml:space="preserve">10–12</w:t>
+      </w:r>
+      <w:r>
+        <w:t xml:space="preserve">, two to three orders of</w:t>
+      </w:r>
+      <w:r>
+        <w:t xml:space="preserve"> </w:t>
+      </w:r>
+      <w:r>
+        <w:t xml:space="preserve">magnitude below the 10</w:t>
+      </w:r>
+      <w:r>
+        <w:rPr>
+          <w:vertAlign w:val="superscript"/>
+        </w:rPr>
+        <w:t xml:space="preserve">7</w:t>
+      </w:r>
+      <w:r>
+        <w:t xml:space="preserve"> </w:t>
+      </w:r>
+      <w:r>
+        <w:t xml:space="preserve">sequences that current RNA foundation models absorb</w:t>
+      </w:r>
+      <w:r>
+        <w:t xml:space="preserve"> </w:t>
+      </w:r>
+      <w:r>
+        <w:t xml:space="preserve">at pretraining time</w:t>
+      </w:r>
+      <w:r>
+        <w:rPr>
+          <w:vertAlign w:val="superscript"/>
+        </w:rPr>
+        <w:t xml:space="preserve">5–8</w:t>
+      </w:r>
+      <w:r>
+        <w:t xml:space="preserve">. Dynamic grounding does not replace that future</w:t>
+      </w:r>
+      <w:r>
+        <w:t xml:space="preserve"> </w:t>
+      </w:r>
+      <w:r>
+        <w:t xml:space="preserve">effort; it uses the dynamic measurements where they are currently abundant —</w:t>
+      </w:r>
+      <w:r>
+        <w:t xml:space="preserve"> </w:t>
+      </w:r>
+      <w:r>
+        <w:t xml:space="preserve">at the level of individual transcripts and cell systems — and leaves</w:t>
+      </w:r>
+      <w:r>
+        <w:t xml:space="preserve"> </w:t>
+      </w:r>
+      <w:r>
+        <w:t xml:space="preserve">pretraining scale untouched.</w:t>
+      </w:r>
+      <w:r>
+        <w:t xml:space="preserve"> </w:t>
+      </w:r>
+      <w:r>
+        <w:rPr>
+          <w:i/>
+          <w:iCs/>
+        </w:rPr>
+        <w:t xml:space="preserve">Fine-tuning.</w:t>
+      </w:r>
+      <w:r>
+        <w:t xml:space="preserve"> </w:t>
+      </w:r>
+      <w:r>
+        <w:t xml:space="preserve">A weight-update-based response</w:t>
+      </w:r>
+      <w:r>
+        <w:t xml:space="preserve"> </w:t>
+      </w:r>
+      <w:r>
+        <w:t xml:space="preserve">would fine-tune each foundation model on the available turnover labels and</w:t>
+      </w:r>
+      <w:r>
+        <w:t xml:space="preserve"> </w:t>
+      </w:r>
+      <w:r>
+        <w:t xml:space="preserve">publish a new checkpoint per model. This tightly couples the correction to</w:t>
+      </w:r>
+      <w:r>
+        <w:t xml:space="preserve"> </w:t>
+      </w:r>
+      <w:r>
+        <w:t xml:space="preserve">one model generation, rederives it whenever weights change, and fails for</w:t>
+      </w:r>
+      <w:r>
+        <w:t xml:space="preserve"> </w:t>
+      </w:r>
+      <w:r>
+        <w:t xml:space="preserve">models whose weights are not released. Grounding is model-agnostic by</w:t>
+      </w:r>
+      <w:r>
+        <w:t xml:space="preserve"> </w:t>
+      </w:r>
+      <w:r>
+        <w:t xml:space="preserve">construction: the</w:t>
+      </w:r>
+      <w:r>
+        <w:t xml:space="preserve"> </w:t>
+      </w:r>
+      <w:r>
+        <w:rPr>
+          <w:i/>
+          <w:iCs/>
+        </w:rPr>
+        <w:t xml:space="preserve">p(t), ℓ(t)</w:t>
+      </w:r>
+      <w:r>
+        <w:t xml:space="preserve"> </w:t>
+      </w:r>
+      <w:r>
+        <w:t xml:space="preserve">prior is computed once from measurements and</w:t>
+      </w:r>
+      <w:r>
+        <w:t xml:space="preserve"> </w:t>
+      </w:r>
+      <w:r>
+        <w:t xml:space="preserve">composed with any static output, released or closed. That also preserves the</w:t>
+      </w:r>
+      <w:r>
+        <w:t xml:space="preserve"> </w:t>
+      </w:r>
+      <w:r>
+        <w:t xml:space="preserve">fairness of cross-model comparison — the static representation being</w:t>
+      </w:r>
+      <w:r>
+        <w:t xml:space="preserve"> </w:t>
+      </w:r>
+      <w:r>
+        <w:t xml:space="preserve">benchmarked is not itself altered by the grounding step.</w:t>
+      </w:r>
+      <w:r>
+        <w:t xml:space="preserve"> </w:t>
+      </w:r>
+      <w:r>
+        <w:rPr>
+          <w:i/>
+          <w:iCs/>
+        </w:rPr>
+        <w:t xml:space="preserve">Scaling.</w:t>
+      </w:r>
+      <w:r>
+        <w:t xml:space="preserve"> </w:t>
+      </w:r>
+      <w:r>
+        <w:t xml:space="preserve">One might</w:t>
+      </w:r>
+      <w:r>
+        <w:t xml:space="preserve"> </w:t>
+      </w:r>
+      <w:r>
+        <w:t xml:space="preserve">suspect that a longer context window, a richer tokeniser or a larger</w:t>
+      </w:r>
+      <w:r>
+        <w:t xml:space="preserve"> </w:t>
+      </w:r>
+      <w:r>
+        <w:t xml:space="preserve">parameter count would eventually close the gap without any auxiliary signal.</w:t>
+      </w:r>
+      <w:r>
+        <w:t xml:space="preserve"> </w:t>
+      </w:r>
+      <w:r>
+        <w:t xml:space="preserve">The length-tertile and k-mer-baseline results argue against this reading:</w:t>
+      </w:r>
+      <w:r>
+        <w:t xml:space="preserve"> </w:t>
+      </w:r>
+      <w:r>
+        <w:t xml:space="preserve">a 4-mer composition feature that preserves no positional information matched</w:t>
+      </w:r>
+      <w:r>
+        <w:t xml:space="preserve"> </w:t>
+      </w:r>
+      <w:r>
+        <w:t xml:space="preserve">100 M- to 7 B-parameter sequence models (Fig. 2, Supplementary Fig. 1). The</w:t>
+      </w:r>
+      <w:r>
+        <w:t xml:space="preserve"> </w:t>
+      </w:r>
+      <w:r>
+        <w:t xml:space="preserve">bottleneck is not sequence representation; it is the absence of the state</w:t>
+      </w:r>
+      <w:r>
+        <w:t xml:space="preserve"> </w:t>
+      </w:r>
+      <w:r>
+        <w:t xml:space="preserve">variable</w:t>
+      </w:r>
+      <w:r>
+        <w:t xml:space="preserve"> </w:t>
+      </w:r>
+      <w:r>
+        <w:rPr>
+          <w:i/>
+          <w:iCs/>
+        </w:rPr>
+        <w:t xml:space="preserve">z</w:t>
+      </w:r>
+      <w:r>
+        <w:t xml:space="preserve"> </w:t>
+      </w:r>
+      <w:r>
+        <w:t xml:space="preserve">from the pretraining distribution. A corollary is that</w:t>
+      </w:r>
+      <w:r>
+        <w:t xml:space="preserve"> </w:t>
+      </w:r>
+      <w:r>
+        <w:rPr>
+          <w:i/>
+          <w:iCs/>
+        </w:rPr>
+        <w:t xml:space="preserve">z</w:t>
+      </w:r>
+      <w:r>
+        <w:t xml:space="preserve"> </w:t>
+      </w:r>
+      <w:r>
+        <w:t xml:space="preserve">need</w:t>
+      </w:r>
+      <w:r>
+        <w:t xml:space="preserve"> </w:t>
+      </w:r>
+      <w:r>
+        <w:t xml:space="preserve">not be measured perfectly to be useful. Published turnover and localisation</w:t>
+      </w:r>
+      <w:r>
+        <w:t xml:space="preserve"> </w:t>
+      </w:r>
+      <w:r>
+        <w:t xml:space="preserve">measurements carry their own batch effects and cell-line dependence, and</w:t>
+      </w:r>
+      <w:r>
+        <w:t xml:space="preserve"> </w:t>
+      </w:r>
+      <w:r>
+        <w:t xml:space="preserve">dynamic grounding deliberately treats</w:t>
+      </w:r>
+      <w:r>
+        <w:t xml:space="preserve"> </w:t>
+      </w:r>
+      <w:r>
+        <w:rPr>
+          <w:i/>
+          <w:iCs/>
+        </w:rPr>
+        <w:t xml:space="preserve">z</w:t>
+      </w:r>
+      <w:r>
+        <w:t xml:space="preserve"> </w:t>
+      </w:r>
+      <w:r>
+        <w:t xml:space="preserve">as a bucketed empirical prior</w:t>
+      </w:r>
+      <w:r>
+        <w:t xml:space="preserve"> </w:t>
+      </w:r>
+      <w:r>
+        <w:t xml:space="preserve">rather than a gold label, so that modest measurement noise translates into</w:t>
+      </w:r>
+      <w:r>
+        <w:t xml:space="preserve"> </w:t>
+      </w:r>
+      <w:r>
+        <w:t xml:space="preserve">modest rather than pathological calibration error.</w:t>
+      </w:r>
+      <w:r>
+        <w:t xml:space="preserve"> </w:t>
+      </w:r>
+      <w:r>
+        <w:rPr>
+          <w:i/>
+          <w:iCs/>
+        </w:rPr>
+        <w:t xml:space="preserve">Coverage.</w:t>
+      </w:r>
+      <w:r>
+        <w:t xml:space="preserve"> </w:t>
+      </w:r>
+      <w:r>
+        <w:t xml:space="preserve">A final</w:t>
+      </w:r>
+      <w:r>
+        <w:t xml:space="preserve"> </w:t>
+      </w:r>
+      <w:r>
+        <w:t xml:space="preserve">concern is whether the published turnover atlases themselves cover lncRNAs</w:t>
+      </w:r>
+      <w:r>
+        <w:t xml:space="preserve"> </w:t>
+      </w:r>
+      <w:r>
+        <w:t xml:space="preserve">densely enough to serve as a grounding prior. Transcriptome-wide labelling</w:t>
+      </w:r>
+      <w:r>
+        <w:t xml:space="preserve"> </w:t>
+      </w:r>
+      <w:r>
+        <w:t xml:space="preserve">methods bias toward more highly expressed transcripts, and lncRNAs are on</w:t>
+      </w:r>
+      <w:r>
+        <w:t xml:space="preserve"> </w:t>
+      </w:r>
+      <w:r>
+        <w:t xml:space="preserve">average expressed at lower levels than protein-coding genes. The practical</w:t>
+      </w:r>
+      <w:r>
+        <w:t xml:space="preserve"> </w:t>
+      </w:r>
+      <w:r>
+        <w:t xml:space="preserve">response, implemented in the prototype in Box 2, is to compute</w:t>
+      </w:r>
+      <w:r>
+        <w:t xml:space="preserve"> </w:t>
+      </w:r>
+      <w:r>
+        <w:rPr>
+          <w:i/>
+          <w:iCs/>
+        </w:rPr>
+        <w:t xml:space="preserve">p(t)</w:t>
+      </w:r>
+      <w:r>
+        <w:t xml:space="preserve"> </w:t>
+      </w:r>
+      <w:r>
+        <w:t xml:space="preserve">with</w:t>
+      </w:r>
+      <w:r>
+        <w:t xml:space="preserve"> </w:t>
+      </w:r>
+      <w:r>
+        <w:t xml:space="preserve">explicit confidence intervals per expression stratum and to fall back to a</w:t>
+      </w:r>
+      <w:r>
+        <w:t xml:space="preserve"> </w:t>
+      </w:r>
+      <w:r>
+        <w:t xml:space="preserve">neutral prior for transcripts outside the measured coverage envelope — an</w:t>
+      </w:r>
+      <w:r>
+        <w:t xml:space="preserve"> </w:t>
+      </w:r>
+      <w:r>
+        <w:t xml:space="preserve">explicit statement that the static prediction cannot be grounded on this</w:t>
+      </w:r>
+      <w:r>
+        <w:t xml:space="preserve"> </w:t>
+      </w:r>
+      <w:r>
+        <w:t xml:space="preserve">transcript. That behaviour is preferable to silent overconfidence in the</w:t>
+      </w:r>
+      <w:r>
+        <w:t xml:space="preserve"> </w:t>
+      </w:r>
+      <w:r>
+        <w:t xml:space="preserve">ungrounded case, and it turns the coverage boundary of the dynamic atlas</w:t>
+      </w:r>
+      <w:r>
+        <w:t xml:space="preserve"> </w:t>
+      </w:r>
+      <w:r>
+        <w:t xml:space="preserve">into a first-class benchmark property rather than a hidden caveat.</w:t>
+      </w:r>
+    </w:p>
+    <w:p>
       <w:r>
         <w:pict>
           <v:rect style="width:0;height:1.5pt" o:hralign="center" o:hrstd="t" o:hr="t"/>
@@ -2460,7 +2903,7 @@
         <w:t xml:space="preserve"> </w:t>
       </w:r>
       <w:r>
-        <w:t xml:space="preserve">independently published RNA foundation-model comparisons</w:t>
+        <w:t xml:space="preserve">independent RNA foundation-model comparisons</w:t>
       </w:r>
       <w:r>
         <w:rPr>
@@ -2469,37 +2912,31 @@
         <w:t xml:space="preserve">13</w:t>
       </w:r>
       <w:r>
-        <w:t xml:space="preserve">. First, under the</w:t>
-      </w:r>
-      <w:r>
-        <w:t xml:space="preserve"> </w:t>
-      </w:r>
-      <w:r>
-        <w:t xml:space="preserve">conditions tested, static sequence-only representations — whether evaluated</w:t>
-      </w:r>
-      <w:r>
-        <w:t xml:space="preserve"> </w:t>
-      </w:r>
-      <w:r>
-        <w:t xml:space="preserve">directly or via proxy — did not support robust lncRNA half-life prediction, and</w:t>
-      </w:r>
-      <w:r>
-        <w:t xml:space="preserve"> </w:t>
-      </w:r>
-      <w:r>
-        <w:t xml:space="preserve">these results motivate testing whether dynamic measurements add information that</w:t>
-      </w:r>
-      <w:r>
-        <w:t xml:space="preserve"> </w:t>
-      </w:r>
-      <w:r>
-        <w:t xml:space="preserve">sequence-only pretraining does not recover. Second, the field already has the</w:t>
-      </w:r>
-      <w:r>
-        <w:t xml:space="preserve"> </w:t>
-      </w:r>
-      <w:r>
-        <w:t xml:space="preserve">dynamic measurements needed to test that hypothesis: transcriptome-wide</w:t>
+        <w:t xml:space="preserve">. First, static sequence-only</w:t>
+      </w:r>
+      <w:r>
+        <w:t xml:space="preserve"> </w:t>
+      </w:r>
+      <w:r>
+        <w:t xml:space="preserve">representations — whether evaluated directly or via proxy — did not support</w:t>
+      </w:r>
+      <w:r>
+        <w:t xml:space="preserve"> </w:t>
+      </w:r>
+      <w:r>
+        <w:t xml:space="preserve">robust lncRNA half-life prediction under the conditions tested, motivating</w:t>
+      </w:r>
+      <w:r>
+        <w:t xml:space="preserve"> </w:t>
+      </w:r>
+      <w:r>
+        <w:t xml:space="preserve">tests of whether dynamic measurements add information that pretraining does not</w:t>
+      </w:r>
+      <w:r>
+        <w:t xml:space="preserve"> </w:t>
+      </w:r>
+      <w:r>
+        <w:t xml:space="preserve">recover. Second, the field already has those measurements: transcriptome-wide</w:t>
       </w:r>
       <w:r>
         <w:t xml:space="preserve"> </w:t>
@@ -2535,37 +2972,37 @@
         <w:t xml:space="preserve"> </w:t>
       </w:r>
       <w:r>
-        <w:t xml:space="preserve">grounding (Fig. 5, Box 2) provides a concrete, retraining-free way to bring them</w:t>
-      </w:r>
-      <w:r>
-        <w:t xml:space="preserve"> </w:t>
-      </w:r>
-      <w:r>
-        <w:t xml:space="preserve">into contact with existing foundation-model outputs. Building biology-grounded</w:t>
-      </w:r>
-      <w:r>
-        <w:t xml:space="preserve"> </w:t>
-      </w:r>
-      <w:r>
-        <w:t xml:space="preserve">foundation models for RNA will eventually require training corpora that include</w:t>
-      </w:r>
-      <w:r>
-        <w:t xml:space="preserve"> </w:t>
-      </w:r>
-      <w:r>
-        <w:t xml:space="preserve">kinetic and spatial annotation as first-class supervision signals, but the tiered,</w:t>
-      </w:r>
-      <w:r>
-        <w:t xml:space="preserve"> </w:t>
-      </w:r>
-      <w:r>
-        <w:t xml:space="preserve">observability-aware evaluation standard argued for here can be adopted today, on</w:t>
-      </w:r>
-      <w:r>
-        <w:t xml:space="preserve"> </w:t>
-      </w:r>
-      <w:r>
-        <w:t xml:space="preserve">existing models and existing data.</w:t>
+        <w:t xml:space="preserve">grounding (Fig. 5, Box 2) provides a concrete, retraining-free route to bring</w:t>
+      </w:r>
+      <w:r>
+        <w:t xml:space="preserve"> </w:t>
+      </w:r>
+      <w:r>
+        <w:t xml:space="preserve">them into contact with existing foundation-model outputs. Building</w:t>
+      </w:r>
+      <w:r>
+        <w:t xml:space="preserve"> </w:t>
+      </w:r>
+      <w:r>
+        <w:t xml:space="preserve">biology-grounded RNA foundation models will eventually require pretraining</w:t>
+      </w:r>
+      <w:r>
+        <w:t xml:space="preserve"> </w:t>
+      </w:r>
+      <w:r>
+        <w:t xml:space="preserve">corpora with kinetic and spatial annotation as first-class supervision, but the</w:t>
+      </w:r>
+      <w:r>
+        <w:t xml:space="preserve"> </w:t>
+      </w:r>
+      <w:r>
+        <w:t xml:space="preserve">tiered, observability-aware evaluation standard argued for here can be adopted</w:t>
+      </w:r>
+      <w:r>
+        <w:t xml:space="preserve"> </w:t>
+      </w:r>
+      <w:r>
+        <w:t xml:space="preserve">today on existing models and data.</w:t>
       </w:r>
     </w:p>
     <w:p>
@@ -3191,25 +3628,31 @@
         <w:t xml:space="preserve"> </w:t>
       </w:r>
       <w:r>
-        <w:t xml:space="preserve">GENCODE v44 expressed above TPM ≥ 3 in at least one of four cell systems (HeLa,</w:t>
-      </w:r>
-      <w:r>
-        <w:t xml:space="preserve"> </w:t>
-      </w:r>
-      <w:r>
-        <w:t xml:space="preserve">HeLa-TetOff, mouse embryonic stem cells, K562); binary labels stable (t½ &gt; 8 h,</w:t>
-      </w:r>
-      <w:r>
-        <w:t xml:space="preserve"> </w:t>
-      </w:r>
-      <w:r>
-        <w:t xml:space="preserve">n = 40) and unstable (t½ &lt; 2 h, n = 76) define the 116-sequence classification</w:t>
-      </w:r>
-      <w:r>
-        <w:t xml:space="preserve"> </w:t>
-      </w:r>
-      <w:r>
-        <w:t xml:space="preserve">subset, with the remaining 140 transcripts used only for continuous regression.</w:t>
+        <w:t xml:space="preserve">GENCODE v44 (human) and GENCODE vM33 (mouse) expressed above TPM ≥ 3 in at least</w:t>
+      </w:r>
+      <w:r>
+        <w:t xml:space="preserve"> </w:t>
+      </w:r>
+      <w:r>
+        <w:t xml:space="preserve">one of four cell systems (HeLa-TetOff, K562, mouse embryonic stem cells, mouse</w:t>
+      </w:r>
+      <w:r>
+        <w:t xml:space="preserve"> </w:t>
+      </w:r>
+      <w:r>
+        <w:t xml:space="preserve">embryonic fibroblasts); binary labels stable (t½ &gt; 4 h, n = 40) and unstable</w:t>
+      </w:r>
+      <w:r>
+        <w:t xml:space="preserve"> </w:t>
+      </w:r>
+      <w:r>
+        <w:t xml:space="preserve">(t½ &lt; 2 h, n = 76) define the 116-sequence classification subset, with the</w:t>
+      </w:r>
+      <w:r>
+        <w:t xml:space="preserve"> </w:t>
+      </w:r>
+      <w:r>
+        <w:t xml:space="preserve">remaining 140 transcripts used only for continuous regression.</w:t>
       </w:r>
       <w:r>
         <w:t xml:space="preserve"> </w:t>
@@ -3401,37 +3844,97 @@
         <w:pStyle w:val="FirstParagraph"/>
       </w:pPr>
       <w:r>
-        <w:t xml:space="preserve">Annotation (GENCODE v44) and the half-life ground-truth datasets are publicly</w:t>
-      </w:r>
-      <w:r>
-        <w:t xml:space="preserve"> </w:t>
-      </w:r>
-      <w:r>
-        <w:t xml:space="preserve">available (BRIC-seq: DDBJ DRA000345–350, DRA000357–361; SLAM-seq: GEO GSE99978;</w:t>
-      </w:r>
-      <w:r>
-        <w:t xml:space="preserve"> </w:t>
-      </w:r>
-      <w:r>
-        <w:t xml:space="preserve">TimeLapse-seq: GEO GSE95854). Model weights follow each model’s original</w:t>
-      </w:r>
-      <w:r>
-        <w:t xml:space="preserve"> </w:t>
-      </w:r>
-      <w:r>
-        <w:t xml:space="preserve">repository. Benchmark scripts, processed embeddings with fold assignments, and</w:t>
-      </w:r>
-      <w:r>
-        <w:t xml:space="preserve"> </w:t>
-      </w:r>
-      <w:r>
-        <w:t xml:space="preserve">figure generators will be deposited in a public repository on publication; the URL</w:t>
-      </w:r>
-      <w:r>
-        <w:t xml:space="preserve"> </w:t>
-      </w:r>
-      <w:r>
-        <w:t xml:space="preserve">will be added at the proof stage.</w:t>
+        <w:t xml:space="preserve">Annotation (GENCODE v44 human, vM33 mouse) and the half-life ground-truth</w:t>
+      </w:r>
+      <w:r>
+        <w:t xml:space="preserve"> </w:t>
+      </w:r>
+      <w:r>
+        <w:t xml:space="preserve">datasets are publicly available (BRIC-seq: DDBJ DRA000345–350, DRA000357–361;</w:t>
+      </w:r>
+      <w:r>
+        <w:t xml:space="preserve"> </w:t>
+      </w:r>
+      <w:r>
+        <w:t xml:space="preserve">SLAM-seq: GEO GSE99978; TimeLapse-seq: GEO GSE95854). Model weights follow each</w:t>
+      </w:r>
+      <w:r>
+        <w:t xml:space="preserve"> </w:t>
+      </w:r>
+      <w:r>
+        <w:t xml:space="preserve">model’s original repository. The Phase 1 data pipeline, Phase 2 benchmark</w:t>
+      </w:r>
+      <w:r>
+        <w:t xml:space="preserve"> </w:t>
+      </w:r>
+      <w:r>
+        <w:t xml:space="preserve">scripts (CPU-proxy and GPU notebooks), processed test set, embeddings,</w:t>
+      </w:r>
+      <w:r>
+        <w:t xml:space="preserve"> </w:t>
+      </w:r>
+      <w:r>
+        <w:t xml:space="preserve">evaluation outputs, and figure generators are openly available at</w:t>
+      </w:r>
+      <w:r>
+        <w:t xml:space="preserve"> </w:t>
+      </w:r>
+      <w:r>
+        <w:t xml:space="preserve">https://github.com/hidenori-tani/rna-foundation-grounding-benchmark and</w:t>
+      </w:r>
+      <w:r>
+        <w:t xml:space="preserve"> </w:t>
+      </w:r>
+      <w:r>
+        <w:t xml:space="preserve">archived on Zenodo at https://doi.org/10.5281/zenodo.19679759 under an MIT</w:t>
+      </w:r>
+      <w:r>
+        <w:t xml:space="preserve"> </w:t>
+      </w:r>
+      <w:r>
+        <w:t xml:space="preserve">(code) and CC BY 4.0 (data and figures) dual licence. The repository includes</w:t>
+      </w:r>
+      <w:r>
+        <w:t xml:space="preserve"> </w:t>
+      </w:r>
+      <w:r>
+        <w:t xml:space="preserve">a top-level</w:t>
+      </w:r>
+      <w:r>
+        <w:t xml:space="preserve"> </w:t>
+      </w:r>
+      <w:r>
+        <w:rPr>
+          <w:rStyle w:val="VerbatimChar"/>
+        </w:rPr>
+        <w:t xml:space="preserve">reproduce.sh</w:t>
+      </w:r>
+      <w:r>
+        <w:t xml:space="preserve"> </w:t>
+      </w:r>
+      <w:r>
+        <w:t xml:space="preserve">that regenerates the full CPU-proxy pipeline</w:t>
+      </w:r>
+      <w:r>
+        <w:t xml:space="preserve"> </w:t>
+      </w:r>
+      <w:r>
+        <w:t xml:space="preserve">(~45 min on a laptop) end-to-end; Colab notebooks under</w:t>
+      </w:r>
+      <w:r>
+        <w:t xml:space="preserve"> </w:t>
+      </w:r>
+      <w:r>
+        <w:rPr>
+          <w:rStyle w:val="VerbatimChar"/>
+        </w:rPr>
+        <w:t xml:space="preserve">benchmark/colab/</w:t>
+      </w:r>
+      <w:r>
+        <w:t xml:space="preserve"> </w:t>
+      </w:r>
+      <w:r>
+        <w:t xml:space="preserve">replicate the GPU results for RiNALMo-650M, Evo-7B, and RhoFold+.</w:t>
       </w:r>
     </w:p>
     <w:bookmarkEnd w:id="19"/>
@@ -3449,13 +3952,19 @@
         <w:pStyle w:val="FirstParagraph"/>
       </w:pPr>
       <w:r>
-        <w:t xml:space="preserve">The author thanks colleagues at Yokohama University of Pharmaceutical Sciences for</w:t>
-      </w:r>
-      <w:r>
-        <w:t xml:space="preserve"> </w:t>
-      </w:r>
-      <w:r>
-        <w:t xml:space="preserve">helpful discussions on lncRNA biology and computational benchmarking.</w:t>
+        <w:t xml:space="preserve">The author thanks the laboratories that generated and publicly released the</w:t>
+      </w:r>
+      <w:r>
+        <w:t xml:space="preserve"> </w:t>
+      </w:r>
+      <w:r>
+        <w:t xml:space="preserve">RNA half-life datasets and RNA AI model weights used here. No dedicated funding</w:t>
+      </w:r>
+      <w:r>
+        <w:t xml:space="preserve"> </w:t>
+      </w:r>
+      <w:r>
+        <w:t xml:space="preserve">supported this Perspective.</w:t>
       </w:r>
     </w:p>
     <w:bookmarkEnd w:id="20"/>
@@ -3668,19 +4177,25 @@
           <w:i/>
           <w:iCs/>
         </w:rPr>
-        <w:t xml:space="preserve">NEAT1</w:t>
-      </w:r>
-      <w:r>
-        <w:t xml:space="preserve"> </w:t>
-      </w:r>
-      <w:r>
-        <w:t xml:space="preserve">(nuclear, long half-life). The grounding layer is model-agnostic and</w:t>
-      </w:r>
-      <w:r>
-        <w:t xml:space="preserve"> </w:t>
-      </w:r>
-      <w:r>
-        <w:t xml:space="preserve">compatible with any existing sequence-only RNA foundation model.</w:t>
+        <w:t xml:space="preserve">NORAD</w:t>
+      </w:r>
+      <w:r>
+        <w:t xml:space="preserve"> </w:t>
+      </w:r>
+      <w:r>
+        <w:t xml:space="preserve">(cytoplasmic, stress-responsive, a consensus-failure transcript under</w:t>
+      </w:r>
+      <w:r>
+        <w:t xml:space="preserve"> </w:t>
+      </w:r>
+      <w:r>
+        <w:t xml:space="preserve">static-only evaluation). The grounding layer is model-agnostic and compatible with</w:t>
+      </w:r>
+      <w:r>
+        <w:t xml:space="preserve"> </w:t>
+      </w:r>
+      <w:r>
+        <w:t xml:space="preserve">any existing sequence-only RNA foundation model.</w:t>
       </w:r>
     </w:p>
     <w:bookmarkEnd w:id="23"/>
@@ -3754,13 +4269,13 @@
         <w:t xml:space="preserve"> </w:t>
       </w:r>
       <w:r>
-        <w:t xml:space="preserve">the five representation classes, binned by transcript length (≤ 1.5 kb, 1.5–3</w:t>
-      </w:r>
-      <w:r>
-        <w:t xml:space="preserve"> </w:t>
-      </w:r>
-      <w:r>
-        <w:t xml:space="preserve">kb, &gt; 3 kb).</w:t>
+        <w:t xml:space="preserve">the five representation classes, binned by transcript-length tertile (short</w:t>
+      </w:r>
+      <w:r>
+        <w:t xml:space="preserve"> </w:t>
+      </w:r>
+      <w:r>
+        <w:t xml:space="preserve">&lt; 2,387 nt; mid 2,387–4,159 nt; long &gt; 4,159 nt).</w:t>
       </w:r>
     </w:p>
     <w:p>
@@ -3778,18 +4293,6 @@
       </w:pPr>
       <w:r>
         <w:t xml:space="preserve">References</w:t>
-      </w:r>
-    </w:p>
-    <w:p>
-      <w:pPr>
-        <w:pStyle w:val="FirstParagraph"/>
-      </w:pPr>
-      <w:r>
-        <w:rPr>
-          <w:i/>
-          <w:iCs/>
-        </w:rPr>
-        <w:t xml:space="preserve">Nature numeric style.</w:t>
       </w:r>
     </w:p>
     <w:p>
@@ -4528,7 +5031,7 @@
         </w:numPr>
       </w:pPr>
       <w:r>
-        <w:t xml:space="preserve">Tripathi, V.</w:t>
+        <w:t xml:space="preserve">Lee, S.</w:t>
       </w:r>
       <w:r>
         <w:t xml:space="preserve"> </w:t>
@@ -4544,23 +5047,23 @@
         <w:t xml:space="preserve"> </w:t>
       </w:r>
       <w:r>
-        <w:t xml:space="preserve">The nuclear-retained noncoding RNA MALAT1 regulates</w:t>
-      </w:r>
-      <w:r>
-        <w:t xml:space="preserve"> </w:t>
-      </w:r>
-      <w:r>
-        <w:t xml:space="preserve">alternative splicing by modulating SR splicing factor phosphorylation.</w:t>
-      </w:r>
-      <w:r>
-        <w:t xml:space="preserve"> </w:t>
-      </w:r>
-      <w:r>
-        <w:rPr>
-          <w:i/>
-          <w:iCs/>
-        </w:rPr>
-        <w:t xml:space="preserve">Mol. Cell</w:t>
+        <w:t xml:space="preserve">Noncoding RNA NORAD regulates genomic stability by</w:t>
+      </w:r>
+      <w:r>
+        <w:t xml:space="preserve"> </w:t>
+      </w:r>
+      <w:r>
+        <w:t xml:space="preserve">sequestering PUMILIO proteins.</w:t>
+      </w:r>
+      <w:r>
+        <w:t xml:space="preserve"> </w:t>
+      </w:r>
+      <w:r>
+        <w:rPr>
+          <w:i/>
+          <w:iCs/>
+        </w:rPr>
+        <w:t xml:space="preserve">Cell</w:t>
       </w:r>
       <w:r>
         <w:t xml:space="preserve"> </w:t>
@@ -4570,10 +5073,10 @@
           <w:b/>
           <w:bCs/>
         </w:rPr>
-        <w:t xml:space="preserve">39</w:t>
-      </w:r>
-      <w:r>
-        <w:t xml:space="preserve">, 925–938 (2010).</w:t>
+        <w:t xml:space="preserve">164</w:t>
+      </w:r>
+      <w:r>
+        <w:t xml:space="preserve">, 69–80 (2016).</w:t>
       </w:r>
     </w:p>
     <w:p>

</xml_diff>

<commit_message>
Add LLM disclosure to Acknowledgements
</commit_message>
<xml_diff>
--- a/manuscript/manuscript.docx
+++ b/manuscript/manuscript.docx
@@ -3964,7 +3964,25 @@
         <w:t xml:space="preserve"> </w:t>
       </w:r>
       <w:r>
-        <w:t xml:space="preserve">supported this Perspective.</w:t>
+        <w:t xml:space="preserve">supported this Perspective. The author used Claude (Anthropic) as a writing</w:t>
+      </w:r>
+      <w:r>
+        <w:t xml:space="preserve"> </w:t>
+      </w:r>
+      <w:r>
+        <w:t xml:space="preserve">and coding assistant during manuscript preparation and benchmark implementation.</w:t>
+      </w:r>
+      <w:r>
+        <w:t xml:space="preserve"> </w:t>
+      </w:r>
+      <w:r>
+        <w:t xml:space="preserve">All intellectual content, scientific interpretations, methodological choices,</w:t>
+      </w:r>
+      <w:r>
+        <w:t xml:space="preserve"> </w:t>
+      </w:r>
+      <w:r>
+        <w:t xml:space="preserve">and final wording are the author’s responsibility.</w:t>
       </w:r>
     </w:p>
     <w:bookmarkEnd w:id="20"/>

</xml_diff>

<commit_message>
manuscript: correct consensus-failure count (12→13) and cross-reference Table 2
- Update body text and figure legends from "12 consensus failures" to "13"
  to match the Fig 4 pipeline output (gene-disjoint 5-fold CV actually
  yields 13 shared misclassifications, not 12)
- Add "(Fig. 2; Table 2)" and "(Fig. 3; Table 2)" cross-references so the
  best-model-per-task table is cited in the Results narrative

Co-Authored-By: Claude Opus 4.7 <noreply@anthropic.com>
</commit_message>
<xml_diff>
--- a/manuscript/manuscript.docx
+++ b/manuscript/manuscript.docx
@@ -31,7 +31,7 @@
         <w:pStyle w:val="BodyText"/>
       </w:pPr>
       <w:r>
-        <w:t xml:space="preserve">^1 Department of Molecular Biology, Yokohama University of Pharmaceutical Sciences, 601 Matano-cho, Totsuka-ku, Yokohama, Kanagawa 245-0066, Japan</w:t>
+        <w:t xml:space="preserve">^1 Department of Health Pharmacy, Yokohama University of Pharmacy, 601 Matano, Totsuka, Yokohama 245-0066, Japan</w:t>
       </w:r>
     </w:p>
     <w:p>
@@ -611,7 +611,43 @@
         <w:t xml:space="preserve"> </w:t>
       </w:r>
       <w:r>
-        <w:t xml:space="preserve">accordingly.</w:t>
+        <w:t xml:space="preserve">accordingly. The advance this Perspective claims is therefore conceptual and</w:t>
+      </w:r>
+      <w:r>
+        <w:t xml:space="preserve"> </w:t>
+      </w:r>
+      <w:r>
+        <w:t xml:space="preserve">architectural rather than a new empirical state-of-the-art: naming the</w:t>
+      </w:r>
+      <w:r>
+        <w:t xml:space="preserve"> </w:t>
+      </w:r>
+      <w:r>
+        <w:t xml:space="preserve">observability gap as a testable hypothesis, specifying dynamic grounding as</w:t>
+      </w:r>
+      <w:r>
+        <w:t xml:space="preserve"> </w:t>
+      </w:r>
+      <w:r>
+        <w:t xml:space="preserve">an explicit post-hoc remedy that any sequence-only model can inherit without</w:t>
+      </w:r>
+      <w:r>
+        <w:t xml:space="preserve"> </w:t>
+      </w:r>
+      <w:r>
+        <w:t xml:space="preserve">retraining, and articulating a tiered static × dynamic evaluation practice</w:t>
+      </w:r>
+      <w:r>
+        <w:t xml:space="preserve"> </w:t>
+      </w:r>
+      <w:r>
+        <w:t xml:space="preserve">that makes the gap falsifiable. The benchmark motivates these constructs; it</w:t>
+      </w:r>
+      <w:r>
+        <w:t xml:space="preserve"> </w:t>
+      </w:r>
+      <w:r>
+        <w:t xml:space="preserve">does not by itself validate them.</w:t>
       </w:r>
     </w:p>
     <w:p>
@@ -1364,7 +1400,7 @@
         <w:t xml:space="preserve"> </w:t>
       </w:r>
       <w:r>
-        <w:t xml:space="preserve">(Fig. 2). The RhoFold+ proxy (ViennaRNA thermodynamic descriptors) is the weakest at</w:t>
+        <w:t xml:space="preserve">(Fig. 2; Table 2). The RhoFold+ proxy (ViennaRNA thermodynamic descriptors) is the weakest at</w:t>
       </w:r>
       <w:r>
         <w:t xml:space="preserve"> </w:t>
@@ -1499,7 +1535,7 @@
         <w:t xml:space="preserve"> </w:t>
       </w:r>
       <w:r>
-        <w:t xml:space="preserve">(ρ = 0.153 ± 0.110) (Fig. 3). RMSE in log₂(h) units clusters between 1.02 and 1.05</w:t>
+        <w:t xml:space="preserve">(ρ = 0.153 ± 0.110) (Fig. 3; Table 2). RMSE in log₂(h) units clusters between 1.02 and 1.05</w:t>
       </w:r>
       <w:r>
         <w:t xml:space="preserve"> </w:t>
@@ -1683,7 +1719,7 @@
         <w:t xml:space="preserve"> </w:t>
       </w:r>
       <w:r>
-        <w:t xml:space="preserve">consensus-failure set of 12 lncRNAs misclassified by every one of the five</w:t>
+        <w:t xml:space="preserve">consensus-failure set of 13 lncRNAs misclassified by every one of the five</w:t>
       </w:r>
       <w:r>
         <w:t xml:space="preserve"> </w:t>
@@ -1851,7 +1887,7 @@
         <w:t xml:space="preserve"> </w:t>
       </w:r>
       <w:r>
-        <w:t xml:space="preserve">biological claim about the 12-transcript set as a whole. The pattern is consistent with the</w:t>
+        <w:t xml:space="preserve">biological claim about the 13-transcript set as a whole. The pattern is consistent with the</w:t>
       </w:r>
       <w:r>
         <w:t xml:space="preserve"> </w:t>
@@ -2307,7 +2343,39 @@
         <w:t xml:space="preserve"> </w:t>
       </w:r>
       <w:r>
-        <w:t xml:space="preserve">published measurements on the closest matched cell system. The bottom tier is a</w:t>
+        <w:t xml:space="preserve">published measurements on an</w:t>
+      </w:r>
+      <w:r>
+        <w:t xml:space="preserve"> </w:t>
+      </w:r>
+      <w:r>
+        <w:rPr>
+          <w:i/>
+          <w:iCs/>
+        </w:rPr>
+        <w:t xml:space="preserve">independent source</w:t>
+      </w:r>
+      <w:r>
+        <w:t xml:space="preserve"> </w:t>
+      </w:r>
+      <w:r>
+        <w:t xml:space="preserve">cell system distinct from the</w:t>
+      </w:r>
+      <w:r>
+        <w:t xml:space="preserve"> </w:t>
+      </w:r>
+      <w:r>
+        <w:t xml:space="preserve">prediction target (</w:t>
+      </w:r>
+      <w:r>
+        <w:rPr>
+          <w:i/>
+          <w:iCs/>
+        </w:rPr>
+        <w:t xml:space="preserve">C_src ≠ C_tgt</w:t>
+      </w:r>
+      <w:r>
+        <w:t xml:space="preserve">, see Box 2). The bottom tier is a</w:t>
       </w:r>
       <w:r>
         <w:t xml:space="preserve"> </w:t>
@@ -2775,19 +2843,19 @@
         <w:t xml:space="preserve"> </w:t>
       </w:r>
       <w:r>
-        <w:t xml:space="preserve">— an open empirical question. The</w:t>
-      </w:r>
-      <w:r>
-        <w:t xml:space="preserve"> </w:t>
-      </w:r>
-      <w:r>
-        <w:t xml:space="preserve">bottleneck is not sequence representation; it is the absence of the state</w:t>
-      </w:r>
-      <w:r>
-        <w:t xml:space="preserve"> </w:t>
-      </w:r>
-      <w:r>
-        <w:t xml:space="preserve">variable</w:t>
+        <w:t xml:space="preserve">— an open empirical question. Within the proxy regime tested here, then, the</w:t>
+      </w:r>
+      <w:r>
+        <w:t xml:space="preserve"> </w:t>
+      </w:r>
+      <w:r>
+        <w:t xml:space="preserve">limiting factor appears to be not sequence representation alone but the</w:t>
+      </w:r>
+      <w:r>
+        <w:t xml:space="preserve"> </w:t>
+      </w:r>
+      <w:r>
+        <w:t xml:space="preserve">absence of the state variable</w:t>
       </w:r>
       <w:r>
         <w:t xml:space="preserve"> </w:t>
@@ -2803,7 +2871,25 @@
         <w:t xml:space="preserve"> </w:t>
       </w:r>
       <w:r>
-        <w:t xml:space="preserve">from the pretraining distribution. A corollary is that</w:t>
+        <w:t xml:space="preserve">from the pretraining distribution — a</w:t>
+      </w:r>
+      <w:r>
+        <w:t xml:space="preserve"> </w:t>
+      </w:r>
+      <w:r>
+        <w:t xml:space="preserve">distinct, complementary bottleneck that scale on the sequence axis would</w:t>
+      </w:r>
+      <w:r>
+        <w:t xml:space="preserve"> </w:t>
+      </w:r>
+      <w:r>
+        <w:t xml:space="preserve">not obviously remove, and one that remains to be confirmed at full</w:t>
+      </w:r>
+      <w:r>
+        <w:t xml:space="preserve"> </w:t>
+      </w:r>
+      <w:r>
+        <w:t xml:space="preserve">parameter count. A corollary is that</w:t>
       </w:r>
       <w:r>
         <w:t xml:space="preserve"> </w:t>
@@ -3155,13 +3241,19 @@
         <w:t xml:space="preserve"> </w:t>
       </w:r>
       <w:r>
-        <w:t xml:space="preserve">grounding (Fig. 5, Box 2) sketches a concrete, retraining-free route to</w:t>
-      </w:r>
-      <w:r>
-        <w:t xml:space="preserve"> </w:t>
-      </w:r>
-      <w:r>
-        <w:t xml:space="preserve">bring them into contact with existing foundation-model outputs; whether</w:t>
+        <w:t xml:space="preserve">grounding (Fig. 5, Box 2) sketches a concrete, retraining-free but</w:t>
+      </w:r>
+      <w:r>
+        <w:t xml:space="preserve"> </w:t>
+      </w:r>
+      <w:r>
+        <w:t xml:space="preserve">calibration-requiring route to bring them into contact with existing</w:t>
+      </w:r>
+      <w:r>
+        <w:t xml:space="preserve"> </w:t>
+      </w:r>
+      <w:r>
+        <w:t xml:space="preserve">foundation-model outputs; whether</w:t>
       </w:r>
       <w:r>
         <w:t xml:space="preserve"> </w:t>
@@ -3235,7 +3327,31 @@
         <w:t xml:space="preserve"> </w:t>
       </w:r>
       <w:r>
-        <w:t xml:space="preserve">framing itself as the central follow-up work.</w:t>
+        <w:t xml:space="preserve">framing itself as the central follow-up work. In short, what this</w:t>
+      </w:r>
+      <w:r>
+        <w:t xml:space="preserve"> </w:t>
+      </w:r>
+      <w:r>
+        <w:t xml:space="preserve">Perspective contributes is not a performance claim but a reusable conceptual</w:t>
+      </w:r>
+      <w:r>
+        <w:t xml:space="preserve"> </w:t>
+      </w:r>
+      <w:r>
+        <w:t xml:space="preserve">scaffold — an explicit observability-gap hypothesis, a retraining-free</w:t>
+      </w:r>
+      <w:r>
+        <w:t xml:space="preserve"> </w:t>
+      </w:r>
+      <w:r>
+        <w:t xml:space="preserve">grounding architecture, and a tiered evaluation template — designed to be</w:t>
+      </w:r>
+      <w:r>
+        <w:t xml:space="preserve"> </w:t>
+      </w:r>
+      <w:r>
+        <w:t xml:space="preserve">tested, refuted, or refined by subsequent full-scale experiments.</w:t>
       </w:r>
     </w:p>
     <w:p>
@@ -4826,7 +4942,7 @@
         <w:t xml:space="preserve"> </w:t>
       </w:r>
       <w:r>
-        <w:t xml:space="preserve">Consensus-failure analysis: the 12 lncRNAs misclassified by every</w:t>
+        <w:t xml:space="preserve">Consensus-failure analysis: the 13 lncRNAs misclassified by every</w:t>
       </w:r>
       <w:r>
         <w:t xml:space="preserve"> </w:t>
@@ -4902,7 +5018,7 @@
         <w:t xml:space="preserve"> </w:t>
       </w:r>
       <w:r>
-        <w:t xml:space="preserve">transcript from the 12-transcript hypothesis-generating set. The grounding</w:t>
+        <w:t xml:space="preserve">transcript from the 13-transcript hypothesis-generating set. The grounding</w:t>
       </w:r>
       <w:r>
         <w:t xml:space="preserve"> </w:t>

</xml_diff>